<commit_message>
feat: add new resume
</commit_message>
<xml_diff>
--- a/public/resume.docx
+++ b/public/resume.docx
@@ -412,17 +412,23 @@
               <w:spacing w:before="0" w:line="480" w:lineRule="auto"/>
               <w:ind w:left="720" w:hanging="360"/>
               <w:rPr>
-                <w:sz w:val="20"/>
-                <w:szCs w:val="20"/>
-              </w:rPr>
-            </w:pPr>
-            <w:r>
-              <w:rPr>
-                <w:sz w:val="20"/>
-                <w:szCs w:val="20"/>
-                <w:rtl w:val="0"/>
-              </w:rPr>
-              <w:t xml:space="preserve">Built and deployed low-latency Python/FastAPI backend for real-time WebRTC audio processing</w:t>
+                <w:color w:val="e69138"/>
+                <w:sz w:val="20"/>
+                <w:szCs w:val="20"/>
+              </w:rPr>
+            </w:pPr>
+            <w:r>
+              <w:rPr>
+                <w:sz w:val="20"/>
+                <w:szCs w:val="20"/>
+                <w:rtl w:val="0"/>
+              </w:rPr>
+              <w:t xml:space="preserve">Developed cross-platform mobile apps (Flutter/Dart)</w:t>
+            </w:r>
+            <w:r>
+              <w:rPr>
+                <w:rtl w:val="0"/>
+              </w:rPr>
             </w:r>
           </w:p>
           <w:p>
@@ -434,18 +440,18 @@
               <w:spacing w:before="0" w:line="480" w:lineRule="auto"/>
               <w:ind w:left="720" w:hanging="360"/>
               <w:rPr>
-                <w:sz w:val="20"/>
-                <w:szCs w:val="20"/>
-                <w:u w:val="none"/>
-              </w:rPr>
-            </w:pPr>
-            <w:r>
-              <w:rPr>
-                <w:sz w:val="20"/>
-                <w:szCs w:val="20"/>
-                <w:rtl w:val="0"/>
-              </w:rPr>
-              <w:t xml:space="preserve">Trained/fine-tuned LLMs and custom models to power domain-specific voice assistant capabilities</w:t>
+                <w:color w:val="e69138"/>
+                <w:sz w:val="20"/>
+                <w:szCs w:val="20"/>
+              </w:rPr>
+            </w:pPr>
+            <w:r>
+              <w:rPr>
+                <w:sz w:val="20"/>
+                <w:szCs w:val="20"/>
+                <w:rtl w:val="0"/>
+              </w:rPr>
+              <w:t xml:space="preserve">Built and deployed low-latency Python/FastAPI backend for real-time WebRTC audio processing using LiveKit</w:t>
             </w:r>
           </w:p>
           <w:p>
@@ -468,7 +474,7 @@
                 <w:szCs w:val="20"/>
                 <w:rtl w:val="0"/>
               </w:rPr>
-              <w:t xml:space="preserve">Developed cross-platform mobile apps (Flutter/Dart)</w:t>
+              <w:t xml:space="preserve">Trained, fine-tuned, and served LLMs and custom models to power domain-specific voice assistant capabilities</w:t>
             </w:r>
           </w:p>
           <w:p>
@@ -542,6 +548,30 @@
               <w:rPr>
                 <w:rtl w:val="0"/>
               </w:rPr>
+            </w:r>
+          </w:p>
+          <w:p>
+            <w:pPr>
+              <w:numPr>
+                <w:ilvl w:val="0"/>
+                <w:numId w:val="3"/>
+              </w:numPr>
+              <w:spacing w:after="0" w:afterAutospacing="0" w:before="0" w:line="480" w:lineRule="auto"/>
+              <w:ind w:left="720" w:right="0" w:hanging="360"/>
+              <w:rPr>
+                <w:rFonts w:ascii="Arial" w:cs="Arial" w:eastAsia="Arial" w:hAnsi="Arial"/>
+                <w:color w:val="e69138"/>
+                <w:sz w:val="22"/>
+                <w:szCs w:val="22"/>
+              </w:rPr>
+            </w:pPr>
+            <w:r>
+              <w:rPr>
+                <w:sz w:val="20"/>
+                <w:szCs w:val="20"/>
+                <w:rtl w:val="0"/>
+              </w:rPr>
+              <w:t xml:space="preserve">Owned DevOps infrastructure and security on Microsoft Azure, implementing best practices for scalable cloud architecture, firewalling, VPN connectivity, access control, reliability, and operational efficiency</w:t>
             </w:r>
           </w:p>
           <w:p>
@@ -553,18 +583,18 @@
               <w:spacing w:before="0" w:line="480" w:lineRule="auto"/>
               <w:ind w:left="720" w:hanging="360"/>
               <w:rPr>
-                <w:sz w:val="20"/>
-                <w:szCs w:val="20"/>
-                <w:u w:val="none"/>
-              </w:rPr>
-            </w:pPr>
-            <w:r>
-              <w:rPr>
-                <w:sz w:val="20"/>
-                <w:szCs w:val="20"/>
-                <w:rtl w:val="0"/>
-              </w:rPr>
-              <w:t xml:space="preserve">Ship maintainable, reliable and performant full-stack features in React/React Native and Node.js</w:t>
+                <w:color w:val="e69138"/>
+                <w:sz w:val="20"/>
+                <w:szCs w:val="20"/>
+              </w:rPr>
+            </w:pPr>
+            <w:r>
+              <w:rPr>
+                <w:sz w:val="20"/>
+                <w:szCs w:val="20"/>
+                <w:rtl w:val="0"/>
+              </w:rPr>
+              <w:t xml:space="preserve">Improved frontend architecture and developer workflows by introducing best practices, Redux state management, mock servers, and automated testing to increase maintainability and speed up development cycles</w:t>
             </w:r>
           </w:p>
           <w:p>
@@ -578,16 +608,15 @@
               <w:rPr>
                 <w:sz w:val="20"/>
                 <w:szCs w:val="20"/>
-                <w:u w:val="none"/>
-              </w:rPr>
-            </w:pPr>
-            <w:r>
-              <w:rPr>
-                <w:sz w:val="20"/>
-                <w:szCs w:val="20"/>
-                <w:rtl w:val="0"/>
-              </w:rPr>
-              <w:t xml:space="preserve">Responsible for DevOps infrastructure and security on Azure with firewalling and vpn networks</w:t>
+              </w:rPr>
+            </w:pPr>
+            <w:r>
+              <w:rPr>
+                <w:sz w:val="20"/>
+                <w:szCs w:val="20"/>
+                <w:rtl w:val="0"/>
+              </w:rPr>
+              <w:t xml:space="preserve">Ship maintainable, reliable and performant full-stack features in React/React Native, Node.js and MongoDB</w:t>
             </w:r>
           </w:p>
           <w:p>
@@ -596,21 +625,21 @@
                 <w:ilvl w:val="0"/>
                 <w:numId w:val="3"/>
               </w:numPr>
-              <w:spacing w:before="0" w:line="480" w:lineRule="auto"/>
-              <w:ind w:left="720" w:hanging="360"/>
-              <w:rPr>
-                <w:sz w:val="20"/>
-                <w:szCs w:val="20"/>
-                <w:u w:val="none"/>
-              </w:rPr>
-            </w:pPr>
-            <w:r>
-              <w:rPr>
-                <w:sz w:val="20"/>
-                <w:szCs w:val="20"/>
-                <w:rtl w:val="0"/>
-              </w:rPr>
-              <w:t xml:space="preserve">Developed and maintained Next.js application</w:t>
+              <w:spacing w:after="240" w:before="0" w:line="480" w:lineRule="auto"/>
+              <w:ind w:left="720" w:right="0" w:hanging="360"/>
+              <w:rPr>
+                <w:rFonts w:ascii="Arial" w:cs="Arial" w:eastAsia="Arial" w:hAnsi="Arial"/>
+                <w:sz w:val="22"/>
+                <w:szCs w:val="22"/>
+              </w:rPr>
+            </w:pPr>
+            <w:r>
+              <w:rPr>
+                <w:sz w:val="20"/>
+                <w:szCs w:val="20"/>
+                <w:rtl w:val="0"/>
+              </w:rPr>
+              <w:t xml:space="preserve">Developed and maintained a Next.js admin dashboard for managing and monitoring self-service kiosks</w:t>
             </w:r>
             <w:r>
               <w:rPr>
@@ -739,7 +768,7 @@
                 <w:szCs w:val="20"/>
                 <w:rtl w:val="0"/>
               </w:rPr>
-              <w:t xml:space="preserve"> and MongoDB</w:t>
+              <w:t xml:space="preserve"> and PostgreSQL</w:t>
             </w:r>
           </w:p>
           <w:p>
@@ -870,7 +899,7 @@
                 <w:szCs w:val="20"/>
                 <w:rtl w:val="0"/>
               </w:rPr>
-              <w:t xml:space="preserve">Lead for company’s design system</w:t>
+              <w:t xml:space="preserve">Lead for the company's design system</w:t>
             </w:r>
           </w:p>
           <w:p>
@@ -934,7 +963,7 @@
                 <w:szCs w:val="20"/>
                 <w:rtl w:val="0"/>
               </w:rPr>
-              <w:t xml:space="preserve">Developed high-traffic e-commerce applications using Angular</w:t>
+              <w:t xml:space="preserve">Built and scaled high-traffic e-commerce applications using Angular and .NET, with a focus on performance, reliability, and maintainability</w:t>
             </w:r>
           </w:p>
           <w:p>
@@ -1070,6 +1099,78 @@
           </w:tcPr>
           <w:p>
             <w:pPr>
+              <w:spacing w:before="320" w:lineRule="auto"/>
+              <w:rPr>
+                <w:rFonts w:ascii="Open Sans" w:cs="Open Sans" w:eastAsia="Open Sans" w:hAnsi="Open Sans"/>
+                <w:b w:val="1"/>
+                <w:bCs w:val="1"/>
+                <w:color w:val="2079c7"/>
+              </w:rPr>
+            </w:pPr>
+            <w:r>
+              <w:rPr>
+                <w:rFonts w:ascii="Open Sans" w:cs="Open Sans" w:eastAsia="Open Sans" w:hAnsi="Open Sans"/>
+                <w:b w:val="1"/>
+                <w:bCs w:val="1"/>
+                <w:color w:val="2079c7"/>
+                <w:rtl w:val="0"/>
+              </w:rPr>
+              <w:t xml:space="preserve">MACHINE LEARNING</w:t>
+            </w:r>
+          </w:p>
+          <w:p>
+            <w:pPr>
+              <w:spacing w:before="320" w:lineRule="auto"/>
+              <w:rPr/>
+            </w:pPr>
+            <w:r>
+              <w:rPr>
+                <w:rtl w:val="0"/>
+              </w:rPr>
+              <w:t xml:space="preserve">- LLMS, CNN, RNN and Transformer architectures</w:t>
+            </w:r>
+          </w:p>
+          <w:p>
+            <w:pPr>
+              <w:spacing w:before="320" w:lineRule="auto"/>
+              <w:rPr/>
+            </w:pPr>
+            <w:r>
+              <w:rPr>
+                <w:rtl w:val="0"/>
+              </w:rPr>
+              <w:t xml:space="preserve">- Agentic workflows: CrewAI, Agno and Langchain</w:t>
+              <w:br w:type="textWrapping"/>
+              <w:br w:type="textWrapping"/>
+              <w:t xml:space="preserve">- RAG: sparse and dense retrieval</w:t>
+            </w:r>
+          </w:p>
+          <w:p>
+            <w:pPr>
+              <w:spacing w:before="320" w:lineRule="auto"/>
+              <w:rPr/>
+            </w:pPr>
+            <w:r>
+              <w:rPr>
+                <w:rtl w:val="0"/>
+              </w:rPr>
+              <w:t xml:space="preserve">- Prompt engineering (llm-as judge, CoT, ReAct, Reflexion)</w:t>
+            </w:r>
+          </w:p>
+          <w:p>
+            <w:pPr>
+              <w:spacing w:before="320" w:lineRule="auto"/>
+              <w:rPr/>
+            </w:pPr>
+            <w:r>
+              <w:rPr>
+                <w:rtl w:val="0"/>
+              </w:rPr>
+              <w:t xml:space="preserve">- Harnesses: Hermes, PI, Claude Code</w:t>
+            </w:r>
+          </w:p>
+          <w:p>
+            <w:pPr>
               <w:pStyle w:val="Heading1"/>
               <w:pageBreakBefore w:val="0"/>
               <w:pBdr>
@@ -1657,62 +1758,8 @@
             <w:pPr>
               <w:spacing w:before="320" w:lineRule="auto"/>
               <w:ind w:left="0" w:firstLine="0"/>
-              <w:rPr>
-                <w:rFonts w:ascii="Open Sans" w:cs="Open Sans" w:eastAsia="Open Sans" w:hAnsi="Open Sans"/>
-                <w:b w:val="1"/>
-                <w:bCs w:val="1"/>
-                <w:color w:val="2079c7"/>
-              </w:rPr>
-            </w:pPr>
-            <w:r>
-              <w:rPr>
-                <w:rFonts w:ascii="Open Sans" w:cs="Open Sans" w:eastAsia="Open Sans" w:hAnsi="Open Sans"/>
-                <w:b w:val="1"/>
-                <w:bCs w:val="1"/>
-                <w:color w:val="2079c7"/>
-                <w:rtl w:val="0"/>
-              </w:rPr>
-              <w:t xml:space="preserve">MACHINE LEARNING</w:t>
-            </w:r>
-          </w:p>
-          <w:p>
-            <w:pPr>
-              <w:spacing w:before="320" w:lineRule="auto"/>
-              <w:ind w:left="0" w:firstLine="0"/>
               <w:rPr/>
             </w:pPr>
-            <w:r>
-              <w:rPr>
-                <w:rtl w:val="0"/>
-              </w:rPr>
-              <w:t xml:space="preserve">- LLMS, CNN, RNN and Transformer architectures</w:t>
-            </w:r>
-          </w:p>
-          <w:p>
-            <w:pPr>
-              <w:spacing w:before="320" w:lineRule="auto"/>
-              <w:ind w:left="0" w:firstLine="0"/>
-              <w:rPr/>
-            </w:pPr>
-            <w:r>
-              <w:rPr>
-                <w:rtl w:val="0"/>
-              </w:rPr>
-              <w:t xml:space="preserve">- RAG, CrewAI, Agno and Langchain</w:t>
-            </w:r>
-          </w:p>
-          <w:p>
-            <w:pPr>
-              <w:spacing w:before="320" w:lineRule="auto"/>
-              <w:ind w:left="0" w:firstLine="0"/>
-              <w:rPr/>
-            </w:pPr>
-            <w:r>
-              <w:rPr>
-                <w:rtl w:val="0"/>
-              </w:rPr>
-              <w:t xml:space="preserve">- Prompt engineering (llm-as judge, CoT, ReAct, Reflexion)</w:t>
-            </w:r>
             <w:r>
               <w:rPr>
                 <w:rtl w:val="0"/>

</xml_diff>